<commit_message>
feat: add EEPROM/A4988 libraries, update Doxygen docs, and add project guides
Add new EEPROM internal and A4988 stepper motor driver libraries with
Keil projects. Update all peripheral drivers with improved Doxygen
documentation and formatting. Add CLAUDE.md, style guides (estiloC,
estiloEnsamblador, docDoxygen) and testing guide. Remove RTE device
files, old copilot-instructions, and Recortes_Documentacion. Update
.gitignore and Keil project configurations.

Co-Authored-By: Claude Opus 4.6 <noreply@anthropic.com>
</commit_message>
<xml_diff>
--- a/Programación en C - Guía de Estilo.docx
+++ b/Programación en C - Guía de Estilo.docx
@@ -345,7 +345,34 @@
           <w:color w:val="000000"/>
           <w:lang w:eastAsia="es-ES"/>
         </w:rPr>
-        <w:t>tec4x4_inicializar(</w:t>
+        <w:t>Tec</w:t>
+      </w:r>
+      <w:r>
+        <w:rPr>
+          <w:rFonts w:eastAsia="Times New Roman"/>
+          <w:noProof w:val="0"/>
+          <w:color w:val="000000"/>
+          <w:lang w:eastAsia="es-ES"/>
+        </w:rPr>
+        <w:t>4x4</w:t>
+      </w:r>
+      <w:r>
+        <w:rPr>
+          <w:rFonts w:eastAsia="Times New Roman"/>
+          <w:noProof w:val="0"/>
+          <w:color w:val="000000"/>
+          <w:lang w:eastAsia="es-ES"/>
+        </w:rPr>
+        <w:t>I</w:t>
+      </w:r>
+      <w:r>
+        <w:rPr>
+          <w:rFonts w:eastAsia="Times New Roman"/>
+          <w:noProof w:val="0"/>
+          <w:color w:val="000000"/>
+          <w:lang w:eastAsia="es-ES"/>
+        </w:rPr>
+        <w:t>nicializar(</w:t>
       </w:r>
       <w:r>
         <w:rPr>
@@ -447,15 +474,190 @@
           <w:color w:val="8000FF"/>
           <w:lang w:eastAsia="es-ES"/>
         </w:rPr>
+        <w:t>i</w:t>
+      </w:r>
+      <w:r>
+        <w:rPr>
+          <w:rFonts w:eastAsia="Times New Roman"/>
+          <w:noProof w:val="0"/>
+          <w:color w:val="8000FF"/>
+          <w:lang w:eastAsia="es-ES"/>
+        </w:rPr>
+        <w:t>nt</w:t>
+      </w:r>
+      <w:r>
+        <w:rPr>
+          <w:rFonts w:eastAsia="Times New Roman"/>
+          <w:noProof w:val="0"/>
+          <w:color w:val="8000FF"/>
+          <w:lang w:eastAsia="es-ES"/>
+        </w:rPr>
+        <w:t>32_t</w:t>
+      </w:r>
+      <w:r>
+        <w:rPr>
+          <w:rFonts w:eastAsia="Times New Roman"/>
+          <w:noProof w:val="0"/>
+          <w:lang w:eastAsia="es-ES"/>
+        </w:rPr>
+        <w:t xml:space="preserve"> numero_de_elementos</w:t>
+      </w:r>
+      <w:r>
+        <w:rPr>
+          <w:rFonts w:eastAsia="Times New Roman"/>
+          <w:b/>
+          <w:bCs/>
+          <w:noProof w:val="0"/>
+          <w:color w:val="000080"/>
+          <w:lang w:eastAsia="es-ES"/>
+        </w:rPr>
+        <w:t>;</w:t>
+      </w:r>
+    </w:p>
+    <w:p>
+      <w:pPr>
+        <w:pStyle w:val="CodigoNPP"/>
+        <w:rPr>
+          <w:rFonts w:eastAsia="Times New Roman"/>
+          <w:noProof w:val="0"/>
+          <w:lang w:eastAsia="es-ES"/>
+        </w:rPr>
+      </w:pPr>
+      <w:r>
+        <w:rPr>
+          <w:rFonts w:eastAsia="Times New Roman"/>
+          <w:noProof w:val="0"/>
+          <w:color w:val="8000FF"/>
+          <w:lang w:eastAsia="es-ES"/>
+        </w:rPr>
+        <w:t>char</w:t>
+      </w:r>
+      <w:r>
+        <w:rPr>
+          <w:rFonts w:eastAsia="Times New Roman"/>
+          <w:b/>
+          <w:bCs/>
+          <w:noProof w:val="0"/>
+          <w:color w:val="000080"/>
+          <w:lang w:eastAsia="es-ES"/>
+        </w:rPr>
+        <w:t>*</w:t>
+      </w:r>
+      <w:r>
+        <w:rPr>
+          <w:rFonts w:eastAsia="Times New Roman"/>
+          <w:noProof w:val="0"/>
+          <w:lang w:eastAsia="es-ES"/>
+        </w:rPr>
+        <w:t xml:space="preserve"> nombre_usuario</w:t>
+      </w:r>
+      <w:r>
+        <w:rPr>
+          <w:rFonts w:eastAsia="Times New Roman"/>
+          <w:b/>
+          <w:bCs/>
+          <w:noProof w:val="0"/>
+          <w:color w:val="000080"/>
+          <w:lang w:eastAsia="es-ES"/>
+        </w:rPr>
+        <w:t>;</w:t>
+      </w:r>
+    </w:p>
+    <w:p>
+      <w:pPr>
+        <w:pStyle w:val="Ttulo2"/>
+      </w:pPr>
+      <w:r>
+        <w:t>F</w:t>
+      </w:r>
+      <w:r>
+        <w:t>unciones</w:t>
+      </w:r>
+    </w:p>
+    <w:p>
+      <w:r>
+        <w:t>Utiliza nombres descriptivos de su acción y en</w:t>
+      </w:r>
+      <w:r>
+        <w:t xml:space="preserve"> </w:t>
+      </w:r>
+      <w:r>
+        <w:rPr>
+          <w:b/>
+          <w:bCs/>
+        </w:rPr>
+        <w:t>PascalCase</w:t>
+      </w:r>
+      <w:r>
+        <w:t>.</w:t>
+      </w:r>
+    </w:p>
+    <w:p>
+      <w:pPr>
+        <w:pStyle w:val="CodigoNPP"/>
+        <w:rPr>
+          <w:rFonts w:eastAsia="Times New Roman"/>
+          <w:noProof w:val="0"/>
+          <w:lang w:eastAsia="es-ES"/>
+        </w:rPr>
+      </w:pPr>
+      <w:r>
+        <w:rPr>
+          <w:rFonts w:eastAsia="Times New Roman"/>
+          <w:noProof w:val="0"/>
+          <w:color w:val="8000FF"/>
+          <w:lang w:eastAsia="es-ES"/>
+        </w:rPr>
         <w:t>int</w:t>
       </w:r>
       <w:r>
         <w:rPr>
           <w:rFonts w:eastAsia="Times New Roman"/>
           <w:noProof w:val="0"/>
-          <w:lang w:eastAsia="es-ES"/>
-        </w:rPr>
-        <w:t xml:space="preserve"> numero_de_elementos</w:t>
+          <w:color w:val="8000FF"/>
+          <w:lang w:eastAsia="es-ES"/>
+        </w:rPr>
+        <w:t>16_t</w:t>
+      </w:r>
+      <w:r>
+        <w:rPr>
+          <w:rFonts w:eastAsia="Times New Roman"/>
+          <w:noProof w:val="0"/>
+          <w:lang w:eastAsia="es-ES"/>
+        </w:rPr>
+        <w:t xml:space="preserve"> </w:t>
+      </w:r>
+      <w:r>
+        <w:rPr>
+          <w:rFonts w:eastAsia="Times New Roman"/>
+          <w:noProof w:val="0"/>
+          <w:lang w:eastAsia="es-ES"/>
+        </w:rPr>
+        <w:t>C</w:t>
+      </w:r>
+      <w:r>
+        <w:rPr>
+          <w:rFonts w:eastAsia="Times New Roman"/>
+          <w:noProof w:val="0"/>
+          <w:lang w:eastAsia="es-ES"/>
+        </w:rPr>
+        <w:t>alcular</w:t>
+      </w:r>
+      <w:r>
+        <w:rPr>
+          <w:rFonts w:eastAsia="Times New Roman"/>
+          <w:noProof w:val="0"/>
+          <w:lang w:eastAsia="es-ES"/>
+        </w:rPr>
+        <w:t>S</w:t>
+      </w:r>
+      <w:r>
+        <w:rPr>
+          <w:rFonts w:eastAsia="Times New Roman"/>
+          <w:noProof w:val="0"/>
+          <w:lang w:eastAsia="es-ES"/>
+        </w:rPr>
+        <w:t>uma</w:t>
       </w:r>
       <w:r>
         <w:rPr>
@@ -466,18 +668,8 @@
           <w:color w:val="000080"/>
           <w:lang w:eastAsia="es-ES"/>
         </w:rPr>
-        <w:t>;</w:t>
-      </w:r>
-    </w:p>
-    <w:p>
-      <w:pPr>
-        <w:pStyle w:val="CodigoNPP"/>
-        <w:rPr>
-          <w:rFonts w:eastAsia="Times New Roman"/>
-          <w:noProof w:val="0"/>
-          <w:lang w:eastAsia="es-ES"/>
-        </w:rPr>
-      </w:pPr>
+        <w:t>(</w:t>
+      </w:r>
       <w:r>
         <w:rPr>
           <w:rFonts w:eastAsia="Times New Roman"/>
@@ -485,7 +677,24 @@
           <w:color w:val="8000FF"/>
           <w:lang w:eastAsia="es-ES"/>
         </w:rPr>
-        <w:t>char</w:t>
+        <w:t>int</w:t>
+      </w:r>
+      <w:r>
+        <w:rPr>
+          <w:rFonts w:eastAsia="Times New Roman"/>
+          <w:noProof w:val="0"/>
+          <w:color w:val="8000FF"/>
+          <w:lang w:eastAsia="es-ES"/>
+        </w:rPr>
+        <w:t>16_t</w:t>
+      </w:r>
+      <w:r>
+        <w:rPr>
+          <w:rFonts w:eastAsia="Times New Roman"/>
+          <w:noProof w:val="0"/>
+          <w:lang w:eastAsia="es-ES"/>
+        </w:rPr>
+        <w:t xml:space="preserve"> a</w:t>
       </w:r>
       <w:r>
         <w:rPr>
@@ -496,15 +705,41 @@
           <w:color w:val="000080"/>
           <w:lang w:eastAsia="es-ES"/>
         </w:rPr>
-        <w:t>*</w:t>
-      </w:r>
-      <w:r>
-        <w:rPr>
-          <w:rFonts w:eastAsia="Times New Roman"/>
-          <w:noProof w:val="0"/>
-          <w:lang w:eastAsia="es-ES"/>
-        </w:rPr>
-        <w:t xml:space="preserve"> nombre_usuario</w:t>
+        <w:t>,</w:t>
+      </w:r>
+      <w:r>
+        <w:rPr>
+          <w:rFonts w:eastAsia="Times New Roman"/>
+          <w:noProof w:val="0"/>
+          <w:lang w:eastAsia="es-ES"/>
+        </w:rPr>
+        <w:t xml:space="preserve"> </w:t>
+      </w:r>
+      <w:r>
+        <w:rPr>
+          <w:rFonts w:eastAsia="Times New Roman"/>
+          <w:noProof w:val="0"/>
+          <w:color w:val="8000FF"/>
+          <w:lang w:eastAsia="es-ES"/>
+        </w:rPr>
+        <w:t>int</w:t>
+      </w:r>
+      <w:r>
+        <w:rPr>
+          <w:rFonts w:eastAsia="Times New Roman"/>
+          <w:noProof w:val="0"/>
+          <w:color w:val="8000FF"/>
+          <w:lang w:eastAsia="es-ES"/>
+        </w:rPr>
+        <w:t>16_t</w:t>
+      </w:r>
+      <w:r>
+        <w:rPr>
+          <w:rFonts w:eastAsia="Times New Roman"/>
+          <w:noProof w:val="0"/>
+          <w:lang w:eastAsia="es-ES"/>
+        </w:rPr>
+        <w:t xml:space="preserve"> b</w:t>
       </w:r>
       <w:r>
         <w:rPr>
@@ -515,221 +750,58 @@
           <w:color w:val="000080"/>
           <w:lang w:eastAsia="es-ES"/>
         </w:rPr>
-        <w:t>;</w:t>
-      </w:r>
-    </w:p>
-    <w:p>
-      <w:pPr>
-        <w:pStyle w:val="Ttulo2"/>
-      </w:pPr>
-      <w:r>
-        <w:t>F</w:t>
-      </w:r>
-      <w:r>
-        <w:t>unciones</w:t>
-      </w:r>
-    </w:p>
-    <w:p>
-      <w:r>
-        <w:t>Utiliza nombres descriptivos de su acción y en</w:t>
-      </w:r>
-      <w:r>
+        <w:t>);</w:t>
+      </w:r>
+    </w:p>
+    <w:p>
+      <w:pPr>
+        <w:pStyle w:val="CodigoNPP"/>
+        <w:rPr>
+          <w:rFonts w:eastAsia="Times New Roman"/>
+          <w:noProof w:val="0"/>
+          <w:lang w:eastAsia="es-ES"/>
+        </w:rPr>
+      </w:pPr>
+      <w:r>
+        <w:rPr>
+          <w:rFonts w:eastAsia="Times New Roman"/>
+          <w:noProof w:val="0"/>
+          <w:color w:val="8000FF"/>
+          <w:lang w:eastAsia="es-ES"/>
+        </w:rPr>
+        <w:t>void</w:t>
+      </w:r>
+      <w:r>
+        <w:rPr>
+          <w:rFonts w:eastAsia="Times New Roman"/>
+          <w:noProof w:val="0"/>
+          <w:lang w:eastAsia="es-ES"/>
+        </w:rPr>
         <w:t xml:space="preserve"> </w:t>
       </w:r>
       <w:r>
         <w:rPr>
-          <w:b/>
-          <w:bCs/>
-        </w:rPr>
-        <w:t>snake_case</w:t>
-      </w:r>
-      <w:r>
-        <w:t>.</w:t>
-      </w:r>
-    </w:p>
-    <w:p>
-      <w:pPr>
-        <w:pStyle w:val="CodigoNPP"/>
-        <w:rPr>
-          <w:rFonts w:eastAsia="Times New Roman"/>
-          <w:noProof w:val="0"/>
-          <w:lang w:eastAsia="es-ES"/>
-        </w:rPr>
-      </w:pPr>
-      <w:r>
-        <w:rPr>
-          <w:rFonts w:eastAsia="Times New Roman"/>
-          <w:noProof w:val="0"/>
-          <w:color w:val="8000FF"/>
-          <w:lang w:eastAsia="es-ES"/>
-        </w:rPr>
-        <w:t>int</w:t>
-      </w:r>
-      <w:r>
-        <w:rPr>
-          <w:rFonts w:eastAsia="Times New Roman"/>
-          <w:noProof w:val="0"/>
-          <w:lang w:eastAsia="es-ES"/>
-        </w:rPr>
-        <w:t xml:space="preserve"> </w:t>
-      </w:r>
-      <w:r>
-        <w:rPr>
-          <w:rFonts w:eastAsia="Times New Roman"/>
-          <w:noProof w:val="0"/>
-          <w:lang w:eastAsia="es-ES"/>
-        </w:rPr>
-        <w:t>c</w:t>
-      </w:r>
-      <w:r>
-        <w:rPr>
-          <w:rFonts w:eastAsia="Times New Roman"/>
-          <w:noProof w:val="0"/>
-          <w:lang w:eastAsia="es-ES"/>
-        </w:rPr>
-        <w:t>alcular</w:t>
-      </w:r>
-      <w:r>
-        <w:rPr>
-          <w:rFonts w:eastAsia="Times New Roman"/>
-          <w:noProof w:val="0"/>
-          <w:lang w:eastAsia="es-ES"/>
-        </w:rPr>
-        <w:t>_s</w:t>
-      </w:r>
-      <w:r>
-        <w:rPr>
-          <w:rFonts w:eastAsia="Times New Roman"/>
-          <w:noProof w:val="0"/>
-          <w:lang w:eastAsia="es-ES"/>
-        </w:rPr>
-        <w:t>uma</w:t>
-      </w:r>
-      <w:r>
-        <w:rPr>
-          <w:rFonts w:eastAsia="Times New Roman"/>
-          <w:b/>
-          <w:bCs/>
-          <w:noProof w:val="0"/>
-          <w:color w:val="000080"/>
-          <w:lang w:eastAsia="es-ES"/>
-        </w:rPr>
-        <w:t>(</w:t>
-      </w:r>
-      <w:r>
-        <w:rPr>
-          <w:rFonts w:eastAsia="Times New Roman"/>
-          <w:noProof w:val="0"/>
-          <w:color w:val="8000FF"/>
-          <w:lang w:eastAsia="es-ES"/>
-        </w:rPr>
-        <w:t>int</w:t>
-      </w:r>
-      <w:r>
-        <w:rPr>
-          <w:rFonts w:eastAsia="Times New Roman"/>
-          <w:noProof w:val="0"/>
-          <w:lang w:eastAsia="es-ES"/>
-        </w:rPr>
-        <w:t xml:space="preserve"> a</w:t>
-      </w:r>
-      <w:r>
-        <w:rPr>
-          <w:rFonts w:eastAsia="Times New Roman"/>
-          <w:b/>
-          <w:bCs/>
-          <w:noProof w:val="0"/>
-          <w:color w:val="000080"/>
-          <w:lang w:eastAsia="es-ES"/>
-        </w:rPr>
-        <w:t>,</w:t>
-      </w:r>
-      <w:r>
-        <w:rPr>
-          <w:rFonts w:eastAsia="Times New Roman"/>
-          <w:noProof w:val="0"/>
-          <w:lang w:eastAsia="es-ES"/>
-        </w:rPr>
-        <w:t xml:space="preserve"> </w:t>
-      </w:r>
-      <w:r>
-        <w:rPr>
-          <w:rFonts w:eastAsia="Times New Roman"/>
-          <w:noProof w:val="0"/>
-          <w:color w:val="8000FF"/>
-          <w:lang w:eastAsia="es-ES"/>
-        </w:rPr>
-        <w:t>int</w:t>
-      </w:r>
-      <w:r>
-        <w:rPr>
-          <w:rFonts w:eastAsia="Times New Roman"/>
-          <w:noProof w:val="0"/>
-          <w:lang w:eastAsia="es-ES"/>
-        </w:rPr>
-        <w:t xml:space="preserve"> b</w:t>
-      </w:r>
-      <w:r>
-        <w:rPr>
-          <w:rFonts w:eastAsia="Times New Roman"/>
-          <w:b/>
-          <w:bCs/>
-          <w:noProof w:val="0"/>
-          <w:color w:val="000080"/>
-          <w:lang w:eastAsia="es-ES"/>
-        </w:rPr>
-        <w:t>);</w:t>
-      </w:r>
-    </w:p>
-    <w:p>
-      <w:pPr>
-        <w:pStyle w:val="CodigoNPP"/>
-        <w:rPr>
-          <w:rFonts w:eastAsia="Times New Roman"/>
-          <w:noProof w:val="0"/>
-          <w:lang w:eastAsia="es-ES"/>
-        </w:rPr>
-      </w:pPr>
-      <w:r>
-        <w:rPr>
-          <w:rFonts w:eastAsia="Times New Roman"/>
-          <w:noProof w:val="0"/>
-          <w:color w:val="8000FF"/>
-          <w:lang w:eastAsia="es-ES"/>
-        </w:rPr>
-        <w:t>void</w:t>
-      </w:r>
-      <w:r>
-        <w:rPr>
-          <w:rFonts w:eastAsia="Times New Roman"/>
-          <w:noProof w:val="0"/>
-          <w:lang w:eastAsia="es-ES"/>
-        </w:rPr>
-        <w:t xml:space="preserve"> </w:t>
-      </w:r>
-      <w:r>
-        <w:rPr>
-          <w:rFonts w:eastAsia="Times New Roman"/>
-          <w:noProof w:val="0"/>
-          <w:lang w:eastAsia="es-ES"/>
-        </w:rPr>
-        <w:t>i</w:t>
-      </w:r>
-      <w:r>
-        <w:rPr>
-          <w:rFonts w:eastAsia="Times New Roman"/>
-          <w:noProof w:val="0"/>
-          <w:lang w:eastAsia="es-ES"/>
-        </w:rPr>
-        <w:t>mprimir</w:t>
-      </w:r>
-      <w:r>
-        <w:rPr>
-          <w:rFonts w:eastAsia="Times New Roman"/>
-          <w:noProof w:val="0"/>
-          <w:lang w:eastAsia="es-ES"/>
-        </w:rPr>
-        <w:t>_r</w:t>
+          <w:rFonts w:eastAsia="Times New Roman"/>
+          <w:noProof w:val="0"/>
+          <w:lang w:eastAsia="es-ES"/>
+        </w:rPr>
+        <w:t>I</w:t>
+      </w:r>
+      <w:r>
+        <w:rPr>
+          <w:rFonts w:eastAsia="Times New Roman"/>
+          <w:noProof w:val="0"/>
+          <w:lang w:eastAsia="es-ES"/>
+        </w:rPr>
+        <w:t>mprimi</w:t>
+      </w:r>
+      <w:r>
+        <w:rPr>
+          <w:rFonts w:eastAsia="Times New Roman"/>
+          <w:noProof w:val="0"/>
+          <w:lang w:eastAsia="es-ES"/>
+        </w:rPr>
+        <w:t>R</w:t>
       </w:r>
       <w:r>
         <w:rPr>
@@ -2097,7 +2169,6 @@
         <w:pStyle w:val="Ttulo1"/>
       </w:pPr>
       <w:r>
-        <w:lastRenderedPageBreak/>
         <w:t>Declaraciones</w:t>
       </w:r>
       <w:r>
@@ -2360,6 +2431,14 @@
       <w:r>
         <w:rPr>
           <w:rFonts w:eastAsia="Times New Roman"/>
+          <w:noProof w:val="0"/>
+          <w:lang w:eastAsia="es-ES"/>
+        </w:rPr>
+        <w:t>_t</w:t>
+      </w:r>
+      <w:r>
+        <w:rPr>
+          <w:rFonts w:eastAsia="Times New Roman"/>
           <w:b/>
           <w:bCs/>
           <w:noProof w:val="0"/>
@@ -3076,7 +3155,6 @@
         <w:pStyle w:val="Ttulo2"/>
       </w:pPr>
       <w:r>
-        <w:lastRenderedPageBreak/>
         <w:t>F</w:t>
       </w:r>
       <w:r>
@@ -3128,7 +3206,31 @@
         <w:rPr>
           <w:noProof w:val="0"/>
         </w:rPr>
-        <w:t xml:space="preserve"> mi_funcion</w:t>
+        <w:t xml:space="preserve"> </w:t>
+      </w:r>
+      <w:r>
+        <w:rPr>
+          <w:noProof w:val="0"/>
+        </w:rPr>
+        <w:t>M</w:t>
+      </w:r>
+      <w:r>
+        <w:rPr>
+          <w:noProof w:val="0"/>
+        </w:rPr>
+        <w:t>i</w:t>
+      </w:r>
+      <w:r>
+        <w:rPr>
+          <w:noProof w:val="0"/>
+        </w:rPr>
+        <w:t>F</w:t>
+      </w:r>
+      <w:r>
+        <w:rPr>
+          <w:noProof w:val="0"/>
+        </w:rPr>
+        <w:t>uncion</w:t>
       </w:r>
       <w:r>
         <w:rPr>
@@ -3399,7 +3501,39 @@
           <w:noProof w:val="0"/>
           <w:lang w:val="en-US" w:eastAsia="es-ES"/>
         </w:rPr>
-        <w:t xml:space="preserve"> funcion_inline</w:t>
+        <w:t xml:space="preserve"> </w:t>
+      </w:r>
+      <w:r>
+        <w:rPr>
+          <w:rFonts w:eastAsia="Times New Roman"/>
+          <w:noProof w:val="0"/>
+          <w:lang w:val="en-US" w:eastAsia="es-ES"/>
+        </w:rPr>
+        <w:t>F</w:t>
+      </w:r>
+      <w:r>
+        <w:rPr>
+          <w:rFonts w:eastAsia="Times New Roman"/>
+          <w:noProof w:val="0"/>
+          <w:lang w:val="en-US" w:eastAsia="es-ES"/>
+        </w:rPr>
+        <w:t>uncion</w:t>
+      </w:r>
+      <w:r>
+        <w:rPr>
+          <w:rFonts w:eastAsia="Times New Roman"/>
+          <w:noProof w:val="0"/>
+          <w:lang w:val="en-US" w:eastAsia="es-ES"/>
+        </w:rPr>
+        <w:t>I</w:t>
+      </w:r>
+      <w:r>
+        <w:rPr>
+          <w:rFonts w:eastAsia="Times New Roman"/>
+          <w:noProof w:val="0"/>
+          <w:lang w:val="en-US" w:eastAsia="es-ES"/>
+        </w:rPr>
+        <w:t>nline</w:t>
       </w:r>
       <w:r>
         <w:rPr>
@@ -3612,7 +3746,43 @@
           <w:color w:val="000000"/>
           <w:lang w:val="en-US" w:eastAsia="es-ES"/>
         </w:rPr>
-        <w:t xml:space="preserve"> funcion_inline</w:t>
+        <w:t xml:space="preserve"> </w:t>
+      </w:r>
+      <w:r>
+        <w:rPr>
+          <w:rFonts w:eastAsia="Times New Roman"/>
+          <w:noProof w:val="0"/>
+          <w:color w:val="000000"/>
+          <w:lang w:val="en-US" w:eastAsia="es-ES"/>
+        </w:rPr>
+        <w:t>F</w:t>
+      </w:r>
+      <w:r>
+        <w:rPr>
+          <w:rFonts w:eastAsia="Times New Roman"/>
+          <w:noProof w:val="0"/>
+          <w:color w:val="000000"/>
+          <w:lang w:val="en-US" w:eastAsia="es-ES"/>
+        </w:rPr>
+        <w:t>uncion</w:t>
+      </w:r>
+      <w:r>
+        <w:rPr>
+          <w:rFonts w:eastAsia="Times New Roman"/>
+          <w:noProof w:val="0"/>
+          <w:color w:val="000000"/>
+          <w:lang w:val="en-US" w:eastAsia="es-ES"/>
+        </w:rPr>
+        <w:t>I</w:t>
+      </w:r>
+      <w:r>
+        <w:rPr>
+          <w:rFonts w:eastAsia="Times New Roman"/>
+          <w:noProof w:val="0"/>
+          <w:color w:val="000000"/>
+          <w:lang w:val="en-US" w:eastAsia="es-ES"/>
+        </w:rPr>
+        <w:t>nline</w:t>
       </w:r>
       <w:r>
         <w:rPr>
@@ -3804,9 +3974,21 @@
       </w:pPr>
       <w:r>
         <w:rPr>
-          <w:color w:val="8000FF" w:themeColor="accent2"/>
-        </w:rPr>
-        <w:t xml:space="preserve">int </w:t>
+          <w:rFonts w:eastAsia="Times New Roman"/>
+          <w:noProof w:val="0"/>
+          <w:color w:val="8000FF"/>
+          <w:lang w:eastAsia="es-ES"/>
+        </w:rPr>
+        <w:t>int</w:t>
+      </w:r>
+      <w:r>
+        <w:rPr>
+          <w:rFonts w:eastAsia="Times New Roman"/>
+          <w:noProof w:val="0"/>
+          <w:color w:val="8000FF"/>
+          <w:lang w:eastAsia="es-ES"/>
+        </w:rPr>
+        <w:t>16_t</w:t>
       </w:r>
       <w:r>
         <w:rPr>
@@ -3814,6 +3996,14 @@
           <w:bCs/>
           <w:color w:val="000080" w:themeColor="accent1"/>
         </w:rPr>
+        <w:t xml:space="preserve"> </w:t>
+      </w:r>
+      <w:r>
+        <w:rPr>
+          <w:b/>
+          <w:bCs/>
+          <w:color w:val="000080" w:themeColor="accent1"/>
+        </w:rPr>
         <w:t>*</w:t>
       </w:r>
       <w:r>
@@ -3852,9 +4042,21 @@
       </w:pPr>
       <w:r>
         <w:rPr>
-          <w:color w:val="8000FF" w:themeColor="accent2"/>
+          <w:rFonts w:eastAsia="Times New Roman"/>
+          <w:noProof w:val="0"/>
+          <w:color w:val="8000FF"/>
+          <w:lang w:eastAsia="es-ES"/>
         </w:rPr>
         <w:t>int</w:t>
+      </w:r>
+      <w:r>
+        <w:rPr>
+          <w:rFonts w:eastAsia="Times New Roman"/>
+          <w:noProof w:val="0"/>
+          <w:color w:val="8000FF"/>
+          <w:lang w:eastAsia="es-ES"/>
+        </w:rPr>
+        <w:t>16_t</w:t>
       </w:r>
       <w:r>
         <w:rPr>
@@ -3923,7 +4125,6 @@
         <w:pStyle w:val="Ttulo2"/>
       </w:pPr>
       <w:r>
-        <w:lastRenderedPageBreak/>
         <w:t xml:space="preserve">Inicialización </w:t>
       </w:r>
       <w:r>
@@ -5414,7 +5615,6 @@
         <w:pStyle w:val="Ttulo1"/>
       </w:pPr>
       <w:r>
-        <w:lastRenderedPageBreak/>
         <w:t>Consideraciones Específicas para ARM (C)</w:t>
       </w:r>
     </w:p>
@@ -7144,7 +7344,6 @@
           <w:bCs/>
           <w:lang w:val="en-US" w:eastAsia="es-ES"/>
         </w:rPr>
-        <w:lastRenderedPageBreak/>
         <w:t>En core_cm4</w:t>
       </w:r>
       <w:r>
@@ -8593,7 +8792,6 @@
         <w:rPr>
           <w:noProof/>
         </w:rPr>
-        <w:lastRenderedPageBreak/>
         <w:drawing>
           <wp:inline distT="0" distB="0" distL="0" distR="0" wp14:anchorId="14BF3F49" wp14:editId="6D25D6E6">
             <wp:extent cx="4320000" cy="3643707"/>
@@ -8735,7 +8933,6 @@
         <w:pStyle w:val="Ttulo2"/>
       </w:pPr>
       <w:r>
-        <w:lastRenderedPageBreak/>
         <w:t>Espacio horizontal</w:t>
       </w:r>
     </w:p>
@@ -8939,9 +9136,24 @@
       </w:pPr>
       <w:r>
         <w:rPr>
-          <w:color w:val="8000FF" w:themeColor="accent2"/>
-        </w:rPr>
-        <w:t xml:space="preserve">int </w:t>
+          <w:rFonts w:eastAsia="Times New Roman"/>
+          <w:noProof w:val="0"/>
+          <w:color w:val="8000FF"/>
+          <w:lang w:eastAsia="es-ES"/>
+        </w:rPr>
+        <w:t>int</w:t>
+      </w:r>
+      <w:r>
+        <w:rPr>
+          <w:rFonts w:eastAsia="Times New Roman"/>
+          <w:noProof w:val="0"/>
+          <w:color w:val="8000FF"/>
+          <w:lang w:eastAsia="es-ES"/>
+        </w:rPr>
+        <w:t>16_t</w:t>
+      </w:r>
+      <w:r>
+        <w:t xml:space="preserve"> </w:t>
       </w:r>
       <w:r>
         <w:t xml:space="preserve">resultado </w:t>
@@ -9987,7 +10199,7 @@
           <w:color w:val="008080"/>
           <w:lang w:eastAsia="es-ES"/>
         </w:rPr>
-        <w:t>/*********************************************************************</w:t>
+        <w:t>/**</w:t>
       </w:r>
     </w:p>
     <w:p>
@@ -10005,17 +10217,7 @@
           <w:color w:val="008080"/>
           <w:lang w:eastAsia="es-ES"/>
         </w:rPr>
-        <w:t xml:space="preserve"> * </w:t>
-      </w:r>
-      <w:r>
-        <w:rPr>
-          <w:rFonts w:ascii="Courier New" w:eastAsia="Times New Roman" w:hAnsi="Courier New" w:cs="Courier New"/>
-          <w:b/>
-          <w:bCs/>
-          <w:color w:val="008080"/>
-          <w:lang w:eastAsia="es-ES"/>
-        </w:rPr>
-        <w:t>\brief</w:t>
+        <w:t xml:space="preserve"> </w:t>
       </w:r>
       <w:r>
         <w:rPr>
@@ -10023,71 +10225,109 @@
           <w:color w:val="008080"/>
           <w:lang w:eastAsia="es-ES"/>
         </w:rPr>
-        <w:t xml:space="preserve">      Leer el valor del registro TC de un timer.</w:t>
-      </w:r>
-    </w:p>
-    <w:p>
-      <w:pPr>
-        <w:pStyle w:val="CodigoNPP"/>
+        <w:t xml:space="preserve">* </w:t>
+      </w:r>
+      <w:r>
+        <w:rPr>
+          <w:rFonts w:ascii="Courier New" w:eastAsia="Times New Roman" w:hAnsi="Courier New" w:cs="Courier New"/>
+          <w:b/>
+          <w:bCs/>
+          <w:color w:val="008080"/>
+          <w:lang w:eastAsia="es-ES"/>
+        </w:rPr>
+        <w:t>@</w:t>
+      </w:r>
+      <w:r>
+        <w:rPr>
+          <w:rFonts w:ascii="Courier New" w:eastAsia="Times New Roman" w:hAnsi="Courier New" w:cs="Courier New"/>
+          <w:b/>
+          <w:bCs/>
+          <w:color w:val="008080"/>
+          <w:lang w:eastAsia="es-ES"/>
+        </w:rPr>
+        <w:t>b</w:t>
+      </w:r>
+      <w:r>
+        <w:rPr>
+          <w:rFonts w:ascii="Courier New" w:eastAsia="Times New Roman" w:hAnsi="Courier New" w:cs="Courier New"/>
+          <w:b/>
+          <w:bCs/>
+          <w:color w:val="008080"/>
+          <w:lang w:eastAsia="es-ES"/>
+        </w:rPr>
+        <w:t>rief</w:t>
+      </w:r>
+      <w:r>
         <w:rPr>
           <w:rFonts w:ascii="Courier New" w:eastAsia="Times New Roman" w:hAnsi="Courier New" w:cs="Courier New"/>
           <w:color w:val="008080"/>
           <w:lang w:eastAsia="es-ES"/>
         </w:rPr>
-      </w:pPr>
-      <w:r>
+        <w:t xml:space="preserve">      Leer el valor del registro TC de un timer.</w:t>
+      </w:r>
+    </w:p>
+    <w:p>
+      <w:pPr>
+        <w:pStyle w:val="CodigoNPP"/>
         <w:rPr>
           <w:rFonts w:ascii="Courier New" w:eastAsia="Times New Roman" w:hAnsi="Courier New" w:cs="Courier New"/>
           <w:color w:val="008080"/>
           <w:lang w:eastAsia="es-ES"/>
         </w:rPr>
-        <w:t xml:space="preserve"> * </w:t>
-      </w:r>
-      <w:r>
-        <w:rPr>
-          <w:rFonts w:ascii="Courier New" w:eastAsia="Times New Roman" w:hAnsi="Courier New" w:cs="Courier New"/>
-          <w:b/>
-          <w:bCs/>
-          <w:color w:val="008080"/>
-          <w:lang w:eastAsia="es-ES"/>
-        </w:rPr>
-        <w:t>\param[in]</w:t>
-      </w:r>
+      </w:pPr>
       <w:r>
         <w:rPr>
           <w:rFonts w:ascii="Courier New" w:eastAsia="Times New Roman" w:hAnsi="Courier New" w:cs="Courier New"/>
           <w:color w:val="008080"/>
           <w:lang w:eastAsia="es-ES"/>
         </w:rPr>
-        <w:t xml:space="preserve">  timer_regs puntero al bloque de registros del timer.</w:t>
-      </w:r>
-    </w:p>
-    <w:p>
-      <w:pPr>
-        <w:pStyle w:val="CodigoNPP"/>
+        <w:t xml:space="preserve"> </w:t>
+      </w:r>
+      <w:r>
         <w:rPr>
           <w:rFonts w:ascii="Courier New" w:eastAsia="Times New Roman" w:hAnsi="Courier New" w:cs="Courier New"/>
           <w:color w:val="008080"/>
           <w:lang w:eastAsia="es-ES"/>
         </w:rPr>
-      </w:pPr>
+        <w:t xml:space="preserve">* </w:t>
+      </w:r>
+      <w:r>
+        <w:rPr>
+          <w:rFonts w:ascii="Courier New" w:eastAsia="Times New Roman" w:hAnsi="Courier New" w:cs="Courier New"/>
+          <w:b/>
+          <w:bCs/>
+          <w:color w:val="008080"/>
+          <w:lang w:eastAsia="es-ES"/>
+        </w:rPr>
+        <w:t>@</w:t>
+      </w:r>
+      <w:r>
+        <w:rPr>
+          <w:rFonts w:ascii="Courier New" w:eastAsia="Times New Roman" w:hAnsi="Courier New" w:cs="Courier New"/>
+          <w:b/>
+          <w:bCs/>
+          <w:color w:val="008080"/>
+          <w:lang w:eastAsia="es-ES"/>
+        </w:rPr>
+        <w:t>p</w:t>
+      </w:r>
+      <w:r>
+        <w:rPr>
+          <w:rFonts w:ascii="Courier New" w:eastAsia="Times New Roman" w:hAnsi="Courier New" w:cs="Courier New"/>
+          <w:b/>
+          <w:bCs/>
+          <w:color w:val="008080"/>
+          <w:lang w:eastAsia="es-ES"/>
+        </w:rPr>
+        <w:t>aram[in]</w:t>
+      </w:r>
       <w:r>
         <w:rPr>
           <w:rFonts w:ascii="Courier New" w:eastAsia="Times New Roman" w:hAnsi="Courier New" w:cs="Courier New"/>
           <w:color w:val="008080"/>
           <w:lang w:eastAsia="es-ES"/>
         </w:rPr>
-        <w:t xml:space="preserve"> * </w:t>
-      </w:r>
-      <w:r>
-        <w:rPr>
-          <w:rFonts w:ascii="Courier New" w:eastAsia="Times New Roman" w:hAnsi="Courier New" w:cs="Courier New"/>
-          <w:b/>
-          <w:bCs/>
-          <w:color w:val="008080"/>
-          <w:lang w:eastAsia="es-ES"/>
-        </w:rPr>
-        <w:t>\return</w:t>
+        <w:t xml:space="preserve">  timer_regs </w:t>
       </w:r>
       <w:r>
         <w:rPr>
@@ -10095,7 +10335,69 @@
           <w:color w:val="008080"/>
           <w:lang w:eastAsia="es-ES"/>
         </w:rPr>
-        <w:t xml:space="preserve">      Valor actual del registro TC de un timer.</w:t>
+        <w:t xml:space="preserve">  P</w:t>
+      </w:r>
+      <w:r>
+        <w:rPr>
+          <w:rFonts w:ascii="Courier New" w:eastAsia="Times New Roman" w:hAnsi="Courier New" w:cs="Courier New"/>
+          <w:color w:val="008080"/>
+          <w:lang w:eastAsia="es-ES"/>
+        </w:rPr>
+        <w:t>untero al bloque de registros del timer.</w:t>
+      </w:r>
+    </w:p>
+    <w:p>
+      <w:pPr>
+        <w:pStyle w:val="CodigoNPP"/>
+        <w:rPr>
+          <w:rFonts w:ascii="Courier New" w:eastAsia="Times New Roman" w:hAnsi="Courier New" w:cs="Courier New"/>
+          <w:color w:val="008080"/>
+          <w:lang w:eastAsia="es-ES"/>
+        </w:rPr>
+      </w:pPr>
+      <w:r>
+        <w:rPr>
+          <w:rFonts w:ascii="Courier New" w:eastAsia="Times New Roman" w:hAnsi="Courier New" w:cs="Courier New"/>
+          <w:color w:val="008080"/>
+          <w:lang w:eastAsia="es-ES"/>
+        </w:rPr>
+        <w:t xml:space="preserve"> </w:t>
+      </w:r>
+      <w:r>
+        <w:rPr>
+          <w:rFonts w:ascii="Courier New" w:eastAsia="Times New Roman" w:hAnsi="Courier New" w:cs="Courier New"/>
+          <w:color w:val="008080"/>
+          <w:lang w:eastAsia="es-ES"/>
+        </w:rPr>
+        <w:t xml:space="preserve">* </w:t>
+      </w:r>
+      <w:r>
+        <w:rPr>
+          <w:rFonts w:ascii="Courier New" w:eastAsia="Times New Roman" w:hAnsi="Courier New" w:cs="Courier New"/>
+          <w:b/>
+          <w:bCs/>
+          <w:color w:val="008080"/>
+          <w:lang w:eastAsia="es-ES"/>
+        </w:rPr>
+        <w:t>@</w:t>
+      </w:r>
+      <w:r>
+        <w:rPr>
+          <w:rFonts w:ascii="Courier New" w:eastAsia="Times New Roman" w:hAnsi="Courier New" w:cs="Courier New"/>
+          <w:b/>
+          <w:bCs/>
+          <w:color w:val="008080"/>
+          <w:lang w:eastAsia="es-ES"/>
+        </w:rPr>
+        <w:t>return</w:t>
+      </w:r>
+      <w:r>
+        <w:rPr>
+          <w:rFonts w:ascii="Courier New" w:eastAsia="Times New Roman" w:hAnsi="Courier New" w:cs="Courier New"/>
+          <w:color w:val="008080"/>
+          <w:lang w:eastAsia="es-ES"/>
+        </w:rPr>
+        <w:t xml:space="preserve">     Valor actual del registro TC de un timer.</w:t>
       </w:r>
     </w:p>
     <w:p>
@@ -10147,7 +10449,39 @@
           <w:color w:val="000000"/>
           <w:lang w:val="en-US" w:eastAsia="es-ES"/>
         </w:rPr>
-        <w:t xml:space="preserve"> timer_leer</w:t>
+        <w:t xml:space="preserve"> </w:t>
+      </w:r>
+      <w:r>
+        <w:rPr>
+          <w:rFonts w:ascii="Courier New" w:eastAsia="Times New Roman" w:hAnsi="Courier New" w:cs="Courier New"/>
+          <w:color w:val="000000"/>
+          <w:lang w:val="en-US" w:eastAsia="es-ES"/>
+        </w:rPr>
+        <w:t>T</w:t>
+      </w:r>
+      <w:r>
+        <w:rPr>
+          <w:rFonts w:ascii="Courier New" w:eastAsia="Times New Roman" w:hAnsi="Courier New" w:cs="Courier New"/>
+          <w:color w:val="000000"/>
+          <w:lang w:val="en-US" w:eastAsia="es-ES"/>
+        </w:rPr>
+        <w:t>imer</w:t>
+      </w:r>
+      <w:r>
+        <w:rPr>
+          <w:rFonts w:ascii="Courier New" w:eastAsia="Times New Roman" w:hAnsi="Courier New" w:cs="Courier New"/>
+          <w:color w:val="000000"/>
+          <w:lang w:val="en-US" w:eastAsia="es-ES"/>
+        </w:rPr>
+        <w:t>L</w:t>
+      </w:r>
+      <w:r>
+        <w:rPr>
+          <w:rFonts w:ascii="Courier New" w:eastAsia="Times New Roman" w:hAnsi="Courier New" w:cs="Courier New"/>
+          <w:color w:val="000000"/>
+          <w:lang w:val="en-US" w:eastAsia="es-ES"/>
+        </w:rPr>
+        <w:t>eer</w:t>
       </w:r>
       <w:r>
         <w:rPr>
@@ -10545,7 +10879,6 @@
         <w:pStyle w:val="Ttulo1"/>
       </w:pPr>
       <w:r>
-        <w:lastRenderedPageBreak/>
         <w:t>Guía de Estilo para Ensamblador ARM</w:t>
       </w:r>
     </w:p>
@@ -11052,7 +11385,6 @@
         <w:pStyle w:val="Ttulo1"/>
       </w:pPr>
       <w:r>
-        <w:lastRenderedPageBreak/>
         <w:t>Documentación</w:t>
       </w:r>
       <w:r>
@@ -11521,7 +11853,6 @@
         <w:pStyle w:val="Ttulo2"/>
       </w:pPr>
       <w:r>
-        <w:lastRenderedPageBreak/>
         <w:t>Comentarios de Documentación</w:t>
       </w:r>
     </w:p>
@@ -12245,7 +12576,6 @@
           <w:b/>
           <w:bCs/>
         </w:rPr>
-        <w:lastRenderedPageBreak/>
         <w:t>@details</w:t>
       </w:r>
       <w:r>
@@ -13047,7 +13377,6 @@
         <w:pStyle w:val="Ttulo3"/>
       </w:pPr>
       <w:r>
-        <w:lastRenderedPageBreak/>
         <w:t>Ejemplo de cabecera de función en</w:t>
       </w:r>
       <w:r>
@@ -13627,7 +13956,55 @@
           <w:color w:val="000000"/>
           <w:lang w:val="en-US" w:eastAsia="es-ES"/>
         </w:rPr>
-        <w:t xml:space="preserve"> sensor_read_calibrated</w:t>
+        <w:t xml:space="preserve"> </w:t>
+      </w:r>
+      <w:r>
+        <w:rPr>
+          <w:rFonts w:eastAsia="Times New Roman"/>
+          <w:color w:val="000000"/>
+          <w:lang w:val="en-US" w:eastAsia="es-ES"/>
+        </w:rPr>
+        <w:t>S</w:t>
+      </w:r>
+      <w:r>
+        <w:rPr>
+          <w:rFonts w:eastAsia="Times New Roman"/>
+          <w:color w:val="000000"/>
+          <w:lang w:val="en-US" w:eastAsia="es-ES"/>
+        </w:rPr>
+        <w:t>ensor</w:t>
+      </w:r>
+      <w:r>
+        <w:rPr>
+          <w:rFonts w:eastAsia="Times New Roman"/>
+          <w:color w:val="000000"/>
+          <w:lang w:val="en-US" w:eastAsia="es-ES"/>
+        </w:rPr>
+        <w:t>R</w:t>
+      </w:r>
+      <w:r>
+        <w:rPr>
+          <w:rFonts w:eastAsia="Times New Roman"/>
+          <w:color w:val="000000"/>
+          <w:lang w:val="en-US" w:eastAsia="es-ES"/>
+        </w:rPr>
+        <w:t>ead</w:t>
+      </w:r>
+      <w:r>
+        <w:rPr>
+          <w:rFonts w:eastAsia="Times New Roman"/>
+          <w:color w:val="000000"/>
+          <w:lang w:val="en-US" w:eastAsia="es-ES"/>
+        </w:rPr>
+        <w:t>C</w:t>
+      </w:r>
+      <w:r>
+        <w:rPr>
+          <w:rFonts w:eastAsia="Times New Roman"/>
+          <w:color w:val="000000"/>
+          <w:lang w:val="en-US" w:eastAsia="es-ES"/>
+        </w:rPr>
+        <w:t>alibrated</w:t>
       </w:r>
       <w:r>
         <w:rPr>
@@ -13717,7 +14094,7 @@
           <w:color w:val="000080"/>
           <w:lang w:val="en-US" w:eastAsia="es-ES"/>
         </w:rPr>
-        <w:t xml:space="preserve">                              </w:t>
+        <w:t xml:space="preserve">                            </w:t>
       </w:r>
       <w:r>
         <w:rPr>
@@ -14359,7 +14736,6 @@
         <w:pStyle w:val="Ttulo2"/>
       </w:pPr>
       <w:r>
-        <w:lastRenderedPageBreak/>
         <w:t>Tipos (typedef)</w:t>
       </w:r>
     </w:p>
@@ -14957,9 +15333,17 @@
       <w:r>
         <w:rPr>
           <w:rFonts w:eastAsia="Times New Roman"/>
-          <w:lang w:eastAsia="es-ES"/>
-        </w:rPr>
-        <w:t xml:space="preserve">     enable_parity</w:t>
+          <w:color w:val="8000FF"/>
+          <w:lang w:eastAsia="es-ES"/>
+        </w:rPr>
+        <w:t>_t</w:t>
+      </w:r>
+      <w:r>
+        <w:rPr>
+          <w:rFonts w:eastAsia="Times New Roman"/>
+          <w:lang w:eastAsia="es-ES"/>
+        </w:rPr>
+        <w:t xml:space="preserve">   enable_parity</w:t>
       </w:r>
       <w:r>
         <w:rPr>
@@ -15599,7 +15983,6 @@
         <w:pStyle w:val="Ttulo2"/>
       </w:pPr>
       <w:r>
-        <w:lastRenderedPageBreak/>
         <w:t>Estructuras (struct)</w:t>
       </w:r>
     </w:p>
@@ -16032,10 +16415,18 @@
       <w:r>
         <w:rPr>
           <w:rFonts w:eastAsia="Times New Roman"/>
+          <w:color w:val="8000FF"/>
+          <w:lang w:eastAsia="es-ES"/>
+        </w:rPr>
+        <w:t>_t</w:t>
+      </w:r>
+      <w:r>
+        <w:rPr>
+          <w:rFonts w:eastAsia="Times New Roman"/>
           <w:color w:val="000000"/>
           <w:lang w:eastAsia="es-ES"/>
         </w:rPr>
-        <w:t xml:space="preserve">     enable_parity</w:t>
+        <w:t xml:space="preserve">   enable_parity</w:t>
       </w:r>
       <w:r>
         <w:rPr>
@@ -16475,7 +16866,6 @@
         <w:pStyle w:val="Ttulo2"/>
       </w:pPr>
       <w:r>
-        <w:lastRenderedPageBreak/>
         <w:t>@param[in]</w:t>
       </w:r>
     </w:p>
@@ -17049,7 +17439,6 @@
         </w:numPr>
       </w:pPr>
       <w:r>
-        <w:lastRenderedPageBreak/>
         <w:t>Si se devuelven diferentes valores para indicar éxito o error, descríbelos todos (ej. "0 en caso de éxito, -1 si hay error").</w:t>
       </w:r>
     </w:p>
@@ -17499,7 +17888,6 @@
         <w:pStyle w:val="Ttulo2"/>
       </w:pPr>
       <w:r>
-        <w:lastRenderedPageBreak/>
         <w:t>@see o @ref</w:t>
       </w:r>
     </w:p>
@@ -21266,7 +21654,7 @@
       <w:lang w:eastAsia="es-ES"/>
     </w:rPr>
   </w:style>
-  <w:style w:type="character" w:styleId="Textoennegrita">
+  <w:style w:type="character" w:styleId="Fuerte">
     <w:name w:val="Strong"/>
     <w:basedOn w:val="Fuentedeprrafopredeter"/>
     <w:uiPriority w:val="22"/>
@@ -21983,7 +22371,7 @@
     <w:charset w:val="00"/>
     <w:family w:val="modern"/>
     <w:pitch w:val="fixed"/>
-    <w:sig w:usb0="A1002AFF" w:usb1="4000F9FB" w:usb2="00040000" w:usb3="00000000" w:csb0="000001FF" w:csb1="00000000"/>
+    <w:sig w:usb0="A1002AFF" w:usb1="C200F9FB" w:usb2="00040020" w:usb3="00000000" w:csb0="000001FF" w:csb1="00000000"/>
   </w:font>
   <w:font w:name="Calibri">
     <w:panose1 w:val="020F0502020204030204"/>
@@ -22019,8 +22407,11 @@
   <w:rsids>
     <w:rsidRoot w:val="00CB667B"/>
     <w:rsid w:val="00124BC1"/>
+    <w:rsid w:val="002B33C9"/>
+    <w:rsid w:val="00423938"/>
     <w:rsid w:val="005501D5"/>
     <w:rsid w:val="006C7C32"/>
+    <w:rsid w:val="006F14E9"/>
     <w:rsid w:val="00706A49"/>
     <w:rsid w:val="00724E74"/>
     <w:rsid w:val="007434A8"/>
@@ -22034,6 +22425,7 @@
     <w:rsid w:val="00CB667B"/>
     <w:rsid w:val="00DD35D9"/>
     <w:rsid w:val="00ED78A3"/>
+    <w:rsid w:val="00FF4ED6"/>
   </w:rsids>
   <m:mathPr>
     <m:mathFont m:val="Cambria Math"/>

</xml_diff>